<commit_message>
test(harness): goldens for image-save fixes — T9/replace pass + new C1 (¶ image)
Re-captured corpus/T9/replace as PASS (was xfail L#8): full-table Replace cell
image now survives save — after.docx 1 media + a:blip (build .9). New case C1
(image in a top-level paragraph, fixture img-para): Replace (P2 'Photo'+img →
'Caption'+img, 2 media/2 blips) + Insert ('Extra'+img inline, 3 media/3 blips),
both images persist. cases.csv: T9 status_replace xfail→pass, C1 added; matrices
regenerated. (T9/insert already pass — equivalent under the new PasteHtml path.)
</commit_message>
<xml_diff>
--- a/test-harness/corpus/T9/replace/after.docx
+++ b/test-harness/corpus/T9/replace/after.docx
@@ -47,6 +47,12 @@
             </w:pPr>
             <w:r/>
             <w:r>
+              <w:rPr>
+                <w:rFonts w:hint="default" w:ascii="Times New Roman" w:hAnsi="Times New Roman" w:eastAsia="Times New Roman" w:cs="Times New Roman"/>
+                <w:sz w:val="20"/>
+              </w:rPr>
+            </w:r>
+            <w:r>
               <mc:AlternateContent>
                 <mc:Choice Requires="wpg">
                   <w:drawing>
@@ -54,19 +60,32 @@
                       <wp:extent cx="457200" cy="457200"/>
                       <wp:effectExtent l="0" t="0" r="0" b="0"/>
                       <wp:docPr id="1" name=""/>
-                      <wp:cNvGraphicFramePr/>
+                      <wp:cNvGraphicFramePr>
+                        <a:graphicFrameLocks xmlns:a="http://schemas.openxmlformats.org/drawingml/2006/main" noChangeAspect="1"/>
+                      </wp:cNvGraphicFramePr>
                       <a:graphic xmlns:a="http://schemas.openxmlformats.org/drawingml/2006/main">
                         <a:graphicData uri="http://schemas.openxmlformats.org/drawingml/2006/picture">
                           <pic:pic xmlns:pic="http://schemas.openxmlformats.org/drawingml/2006/picture">
                             <pic:nvPicPr>
-                              <pic:cNvPr id="484937766" name="scribe-img-0"/>
-                              <pic:cNvPicPr/>
+                              <pic:cNvPr id="1570699836" name=""/>
+                              <pic:cNvPicPr>
+                                <a:picLocks noChangeAspect="1"/>
+                              </pic:cNvPicPr>
                               <pic:nvPr/>
                             </pic:nvPicPr>
-                            <pic:blipFill dpi="7602275">
-                              <a:tile algn="b" flip="none" sx="38797760" sy="8" tx="67895296" ty="104"/>
+                            <pic:blipFill rotWithShape="1">
+                              <a:blip r:embed="rId8"/>
+                              <a:stretch/>
                             </pic:blipFill>
-                            <pic:spPr/>
+                            <pic:spPr bwMode="auto">
+                              <a:xfrm>
+                                <a:off x="0" y="0"/>
+                                <a:ext cx="457200" cy="457200"/>
+                              </a:xfrm>
+                              <a:prstGeom prst="rect">
+                                <a:avLst/>
+                              </a:prstGeom>
+                            </pic:spPr>
                           </pic:pic>
                         </a:graphicData>
                       </a:graphic>
@@ -95,11 +114,18 @@
                       <o:lock v:ext="edit" aspectratio="t"/>
                     </v:shapetype>
                     <v:shape id="_x0000_i0" o:spid="_x0000_s0" type="#_x0000_t75" style="width:36.00pt;height:36.00pt;mso-wrap-distance-left:0.00pt;mso-wrap-distance-top:0.00pt;mso-wrap-distance-right:0.00pt;mso-wrap-distance-bottom:0.00pt;z-index:1;" stroked="false">
+                      <v:imagedata r:id="rId8" o:title=""/>
                       <o:lock v:ext="edit" rotation="t"/>
                     </v:shape>
                   </w:pict>
                 </mc:Fallback>
               </mc:AlternateContent>
+            </w:r>
+            <w:r>
+              <w:rPr>
+                <w:rFonts w:hint="default" w:ascii="Times New Roman" w:hAnsi="Times New Roman" w:eastAsia="Times New Roman" w:cs="Times New Roman"/>
+                <w:sz w:val="20"/>
+              </w:rPr>
             </w:r>
             <w:r/>
           </w:p>

</xml_diff>